<commit_message>
docs: update Scientific Process Document with all scientific review changes
Sections 16 (Geospatial Safety) updated: home-zone suppression ×0.85 (IPV),
fail-safe defaults (is_known_area=False), phone disconnect 0.4 + 5-min gate,
severity-based alert priority, high_risk persistence gate, speed 140 km/h.
Section 17 (References) reorganized with new citations: Kangas 2008, Madgwick
2010, Bourke 2007, Bagala 2012, Luks 2017, WHO 2021 IPV.

Co-Authored-By: Claude Opus 4.6 <noreply@anthropic.com>
</commit_message>
<xml_diff>
--- a/SCIENTIFIC_PROCESS_DOCUMENT.docx
+++ b/SCIENTIFIC_PROCESS_DOCUMENT.docx
@@ -1443,7 +1443,7 @@
                 <w:sz w:val="20"/>
                 <w:szCs w:val="20"/>
               </w:rPr>
-              <w:t xml:space="preserve">≤ 95%</w:t>
+              <w:t xml:space="preserve">≤ 94%</w:t>
             </w:r>
           </w:p>
         </w:tc>
@@ -1501,7 +1501,7 @@
                 <w:sz w:val="20"/>
                 <w:szCs w:val="20"/>
               </w:rPr>
-              <w:t xml:space="preserve">Normal SpO2 is 95–100%. Values at or below 95% indicate clinical concern requiring monitoring</w:t>
+              <w:t xml:space="preserve">BTS/WHO clinical-concern boundary. Target saturation for healthy adults is 94–98%; values ≤94% require monitoring</w:t>
             </w:r>
           </w:p>
         </w:tc>
@@ -1750,7 +1750,7 @@
                 <w:sz w:val="20"/>
                 <w:szCs w:val="20"/>
               </w:rPr>
-              <w:t xml:space="preserve">The z-score SpO2 flag includes a clinical floor check: z-score deviation only triggers when the actual SpO2 value is below 96%. Values 96–100% are clinically normal and should not alarm the user even if they deviate significantly from a high personal baseline (e.g., a user with baseline 98.5 ± 0.5 showing SpO2 of 97%). This prevents false “oxygen is low” alerts for healthy individuals with naturally high baselines.</w:t>
+              <w:t xml:space="preserve">The z-score SpO2 flag includes a clinical floor check: z-score deviation only triggers when the actual SpO2 value is below 94%. Values 94–100% are clinically normal per BTS guidelines and should not alarm the user even if they deviate significantly from a high personal baseline. This prevents false “oxygen is low” alerts for healthy individuals with naturally high baselines.</w:t>
             </w:r>
           </w:p>
         </w:tc>
@@ -1775,7 +1775,7 @@
           <w:sz w:val="26"/>
           <w:szCs w:val="26"/>
         </w:rPr>
-        <w:t xml:space="preserve">2.3 Heart Rate Variability (HRV RMSSD) — Weight: 0.25</w:t>
+        <w:t xml:space="preserve">2.3 HR Stability Score — Weight: 0.25</w:t>
       </w:r>
     </w:p>
     <w:p>
@@ -1807,7 +1807,7 @@
           <w:sz w:val="22"/>
           <w:szCs w:val="22"/>
         </w:rPr>
-        <w:t xml:space="preserve">HRV (specifically RMSSD — Root Mean Square of Successive Differences in R-R intervals) reflects the balance between sympathetic and parasympathetic branches of the autonomic nervous system. High RMSSD indicates strong parasympathetic (vagal) tone — the body is relaxed and adaptive. Suppressed RMSSD indicates sympathetic dominance — the classic stress response.</w:t>
+        <w:t xml:space="preserve">The HR Stability Score is derived from beat-to-beat HR variability computed from unsmoothed (despiked but not EMA-filtered) heart rate data. It reflects the balance between sympathetic and parasympathetic branches of the autonomic nervous system. High stability scores indicate strong parasympathetic (vagal) tone; suppressed scores indicate sympathetic dominance — the classic stress response.</w:t>
       </w:r>
     </w:p>
     <w:p>
@@ -1822,7 +1822,7 @@
           <w:sz w:val="22"/>
           <w:szCs w:val="22"/>
         </w:rPr>
-        <w:t xml:space="preserve">HRV is a well-established biomarker in clinical literature (Shaffer &amp; Ginsberg 2017, Thayer et al. 2012) for chronic stress, anxiety, and autonomic dysfunction. Unlike HR (which captures acute stress), HRV captures sustained autonomic imbalance.</w:t>
+        <w:t xml:space="preserve">This metric is informed by HRV literature (Shaffer &amp; Ginsberg 2017, Thayer et al. 2012) but is explicitly labelled “HR Stability Score” rather than “HRV RMSSD” because ring-based PPG at 1 Hz cannot produce clinical-grade RMSSD. The field name is reserved for firmware R1 when proper IBI data becomes available.</w:t>
       </w:r>
     </w:p>
     <w:p>
@@ -2284,7 +2284,7 @@
                 <w:sz w:val="20"/>
                 <w:szCs w:val="20"/>
               </w:rPr>
-              <w:t xml:space="preserve">Ring-based PPG HRV is inherently less accurate than chest-strap ECG (Esco &amp; Flatt 2014). The preprocessing pipeline caps HRV SQI at 0.7 to reflect this limitation. HRV earns a lower weight because measurement noise is higher, but it remains valuable as a complementary autonomic indicator.</w:t>
+              <w:t xml:space="preserve">Ring-based PPG HR stability is inherently less accurate than chest-strap ECG HRV (Esco &amp; Flatt 2014). The preprocessing pipeline caps its SQI at 0.7 to reflect this limitation. It earns a lower weight because measurement noise is higher, but remains valuable as a complementary autonomic indicator. Note: the RMSSD is computed from raw unsmoothed HR to preserve beat-to-beat variability that EMA filtering would destroy.</w:t>
             </w:r>
           </w:p>
         </w:tc>
@@ -2356,7 +2356,7 @@
           <w:sz w:val="22"/>
           <w:szCs w:val="22"/>
         </w:rPr>
-        <w:t xml:space="preserve">This makes skin temperature a poor standalone indicator of distress. However, when combined with other signals, elevated skin temperature supports detection. For example: elevated HR + elevated skin temp + suppressed HRV is more likely genuine fever/infection than HR elevation alone.</w:t>
+        <w:t xml:space="preserve">Skin temperature is now flagged bidirectionally. In acute distress, the sympathetic nervous system triggers peripheral vasoconstriction, causing skin temperature to DROP within 10–30 seconds. A RISING skin temperature indicates fever, fatigue, or parasympathetic activity. Both directions are clinically meaningful but represent different conditions.</w:t>
       </w:r>
     </w:p>
     <w:p>
@@ -2550,7 +2550,7 @@
                 <w:sz w:val="20"/>
                 <w:szCs w:val="20"/>
               </w:rPr>
-              <w:t xml:space="preserve">Z-score</w:t>
+              <w:t xml:space="preserve">Z-score (elevated)</w:t>
             </w:r>
           </w:p>
         </w:tc>
@@ -2637,7 +2637,7 @@
                 <w:sz w:val="20"/>
                 <w:szCs w:val="20"/>
               </w:rPr>
-              <w:t xml:space="preserve">Because skin temp fluctuates with environment, we require a very large personal deviation (2.5 std devs) before considering it meaningful</w:t>
+              <w:t xml:space="preserve">Because skin temp fluctuates with environment, we require a very large personal deviation (2.5 std devs) before considering elevation meaningful. Weak supporting signal.</w:t>
             </w:r>
           </w:p>
         </w:tc>
@@ -2668,6 +2668,124 @@
                 <w:sz w:val="20"/>
                 <w:szCs w:val="20"/>
               </w:rPr>
+              <w:t xml:space="preserve">Z-score (drop)</w:t>
+            </w:r>
+          </w:p>
+        </w:tc>
+        <w:tc>
+          <w:tcPr>
+            <w:tcW w:type="dxa" w:w="1400"/>
+            <w:tcBorders>
+              <w:top w:val="single" w:color="B0B8C8" w:sz="1"/>
+              <w:left w:val="single" w:color="B0B8C8" w:sz="1"/>
+              <w:bottom w:val="single" w:color="B0B8C8" w:sz="1"/>
+              <w:right w:val="single" w:color="B0B8C8" w:sz="1"/>
+            </w:tcBorders>
+            <w:shd w:fill="F0F4FA" w:val="clear"/>
+            <w:tcMar>
+              <w:top w:type="dxa" w:w="80"/>
+              <w:left w:type="dxa" w:w="120"/>
+              <w:bottom w:type="dxa" w:w="80"/>
+              <w:right w:type="dxa" w:w="120"/>
+            </w:tcMar>
+          </w:tcPr>
+          <w:p>
+            <w:r>
+              <w:rPr>
+                <w:rFonts w:ascii="Arial" w:cs="Arial" w:eastAsia="Arial" w:hAnsi="Arial"/>
+                <w:color w:val="1A1A2E"/>
+                <w:sz w:val="20"/>
+                <w:szCs w:val="20"/>
+              </w:rPr>
+              <w:t xml:space="preserve">&lt; −1.5</w:t>
+            </w:r>
+          </w:p>
+        </w:tc>
+        <w:tc>
+          <w:tcPr>
+            <w:tcW w:type="dxa" w:w="2800"/>
+            <w:tcBorders>
+              <w:top w:val="single" w:color="B0B8C8" w:sz="1"/>
+              <w:left w:val="single" w:color="B0B8C8" w:sz="1"/>
+              <w:bottom w:val="single" w:color="B0B8C8" w:sz="1"/>
+              <w:right w:val="single" w:color="B0B8C8" w:sz="1"/>
+            </w:tcBorders>
+            <w:shd w:fill="F0F4FA" w:val="clear"/>
+            <w:tcMar>
+              <w:top w:type="dxa" w:w="80"/>
+              <w:left w:type="dxa" w:w="120"/>
+              <w:bottom w:type="dxa" w:w="80"/>
+              <w:right w:type="dxa" w:w="120"/>
+            </w:tcMar>
+          </w:tcPr>
+          <w:p>
+            <w:r>
+              <w:rPr>
+                <w:rFonts w:ascii="Arial" w:cs="Arial" w:eastAsia="Arial" w:hAnsi="Arial"/>
+                <w:color w:val="1A1A2E"/>
+                <w:sz w:val="20"/>
+                <w:szCs w:val="20"/>
+              </w:rPr>
+              <w:t xml:space="preserve">Vasoconstriction response</w:t>
+            </w:r>
+          </w:p>
+        </w:tc>
+        <w:tc>
+          <w:tcPr>
+            <w:tcW w:type="dxa" w:w="2960"/>
+            <w:tcBorders>
+              <w:top w:val="single" w:color="B0B8C8" w:sz="1"/>
+              <w:left w:val="single" w:color="B0B8C8" w:sz="1"/>
+              <w:bottom w:val="single" w:color="B0B8C8" w:sz="1"/>
+              <w:right w:val="single" w:color="B0B8C8" w:sz="1"/>
+            </w:tcBorders>
+            <w:shd w:fill="F0F4FA" w:val="clear"/>
+            <w:tcMar>
+              <w:top w:type="dxa" w:w="80"/>
+              <w:left w:type="dxa" w:w="120"/>
+              <w:bottom w:type="dxa" w:w="80"/>
+              <w:right w:type="dxa" w:w="120"/>
+            </w:tcMar>
+          </w:tcPr>
+          <w:p>
+            <w:r>
+              <w:rPr>
+                <w:rFonts w:ascii="Arial" w:cs="Arial" w:eastAsia="Arial" w:hAnsi="Arial"/>
+                <w:color w:val="1A1A2E"/>
+                <w:sz w:val="20"/>
+                <w:szCs w:val="20"/>
+              </w:rPr>
+              <w:t xml:space="preserve">Peripheral vasoconstriction during distress causes rapid skin temp drop. This is a STRONGER signal than elevation and contributes more to distress scoring (1.5× weight).</w:t>
+            </w:r>
+          </w:p>
+        </w:tc>
+      </w:tr>
+      <w:tr>
+        <w:tc>
+          <w:tcPr>
+            <w:tcW w:type="dxa" w:w="2200"/>
+            <w:tcBorders>
+              <w:top w:val="single" w:color="B0B8C8" w:sz="1"/>
+              <w:left w:val="single" w:color="B0B8C8" w:sz="1"/>
+              <w:bottom w:val="single" w:color="B0B8C8" w:sz="1"/>
+              <w:right w:val="single" w:color="B0B8C8" w:sz="1"/>
+            </w:tcBorders>
+            <w:shd w:fill="FFFFFF" w:val="clear"/>
+            <w:tcMar>
+              <w:top w:type="dxa" w:w="80"/>
+              <w:left w:type="dxa" w:w="120"/>
+              <w:bottom w:type="dxa" w:w="80"/>
+              <w:right w:type="dxa" w:w="120"/>
+            </w:tcMar>
+          </w:tcPr>
+          <w:p>
+            <w:r>
+              <w:rPr>
+                <w:rFonts w:ascii="Arial" w:cs="Arial" w:eastAsia="Arial" w:hAnsi="Arial"/>
+                <w:color w:val="1A1A2E"/>
+                <w:sz w:val="20"/>
+                <w:szCs w:val="20"/>
+              </w:rPr>
               <w:t xml:space="preserve">Absolute</w:t>
             </w:r>
           </w:p>
@@ -2681,7 +2799,7 @@
               <w:bottom w:val="single" w:color="B0B8C8" w:sz="1"/>
               <w:right w:val="single" w:color="B0B8C8" w:sz="1"/>
             </w:tcBorders>
-            <w:shd w:fill="F0F4FA" w:val="clear"/>
+            <w:shd w:fill="FFFFFF" w:val="clear"/>
             <w:tcMar>
               <w:top w:type="dxa" w:w="80"/>
               <w:left w:type="dxa" w:w="120"/>
@@ -2710,7 +2828,7 @@
               <w:bottom w:val="single" w:color="B0B8C8" w:sz="1"/>
               <w:right w:val="single" w:color="B0B8C8" w:sz="1"/>
             </w:tcBorders>
-            <w:shd w:fill="F0F4FA" w:val="clear"/>
+            <w:shd w:fill="FFFFFF" w:val="clear"/>
             <w:tcMar>
               <w:top w:type="dxa" w:w="80"/>
               <w:left w:type="dxa" w:w="120"/>
@@ -2739,7 +2857,7 @@
               <w:bottom w:val="single" w:color="B0B8C8" w:sz="1"/>
               <w:right w:val="single" w:color="B0B8C8" w:sz="1"/>
             </w:tcBorders>
-            <w:shd w:fill="F0F4FA" w:val="clear"/>
+            <w:shd w:fill="FFFFFF" w:val="clear"/>
             <w:tcMar>
               <w:top w:type="dxa" w:w="80"/>
               <w:left w:type="dxa" w:w="120"/>
@@ -2804,7 +2922,7 @@
                 <w:sz w:val="22"/>
                 <w:szCs w:val="22"/>
               </w:rPr>
-              <w:t xml:space="preserve">Critical Design Decision: Temp Alone Never Triggers Stress</w:t>
+              <w:t xml:space="preserve">Bidirectional Temperature Flagging</w:t>
             </w:r>
           </w:p>
           <w:p>
@@ -2818,7 +2936,7 @@
                 <w:sz w:val="20"/>
                 <w:szCs w:val="20"/>
               </w:rPr>
-              <w:t xml:space="preserve">Temperature is classified as a “weak/supporting” signal. Even if skin temp exceeds threshold, if it is the ONLY flagged signal, the engine state remains “normal” with an advisory message. This prevents false alarms from ambient heat, hot beverages, or warm rooms.</w:t>
+              <w:t xml:space="preserve">Temperature elevation (z &gt; +2.5) is a weak/supporting signal — alone it never triggers stress. Temperature DROP (z &lt; −1.5) is a stronger distress indicator reflecting sympathetic vasoconstriction and contributes to the weighted distress score at 1.5× the normal temperature weight. This dual-direction approach captures both fever/thermal events and acute distress responses.</w:t>
             </w:r>
           </w:p>
         </w:tc>
@@ -2890,7 +3008,7 @@
           <w:sz w:val="22"/>
           <w:szCs w:val="22"/>
         </w:rPr>
-        <w:t xml:space="preserve">The preprocessing pipeline maintains a rolling baseline of each signal over approximately 300 frames (~5 minutes). Z-scores are computed as:</w:t>
+        <w:t xml:space="preserve">The preprocessing pipeline maintains a rolling baseline of each signal over approximately 1800 frames (~30 minutes), gated on normal engine state to prevent baseline contamination by distress events. Z-scores are computed as:</w:t>
       </w:r>
     </w:p>
     <w:tbl>
@@ -3340,7 +3458,7 @@
                 <w:sz w:val="20"/>
                 <w:szCs w:val="20"/>
               </w:rPr>
-              <w:t xml:space="preserve">≤ 95%</w:t>
+              <w:t xml:space="preserve">≤ 94%</w:t>
             </w:r>
           </w:p>
         </w:tc>
@@ -3650,7 +3768,7 @@
           <w:sz w:val="22"/>
           <w:szCs w:val="22"/>
         </w:rPr>
-        <w:t xml:space="preserve">The engine classifies each evaluation into one of three states based on how many primary signal channels are simultaneously flagged:</w:t>
+        <w:t xml:space="preserve">The engine classifies each evaluation into one of three states based on the weighted severity score of flagged signals, not a simple flag count. This ensures that the clinical significance of WHICH signals are flagged determines the state, not just how many.</w:t>
       </w:r>
     </w:p>
     <w:tbl>
@@ -3667,9 +3785,9 @@
       </w:tblPr>
       <w:tblGrid>
         <w:gridCol w:w="1400"/>
-        <w:gridCol w:w="1600"/>
+        <w:gridCol w:w="1800"/>
         <w:gridCol w:w="1200"/>
-        <w:gridCol w:w="5160"/>
+        <w:gridCol w:w="4960"/>
       </w:tblGrid>
       <w:tr>
         <w:tc>
@@ -3706,7 +3824,7 @@
         </w:tc>
         <w:tc>
           <w:tcPr>
-            <w:tcW w:type="dxa" w:w="1600"/>
+            <w:tcW w:type="dxa" w:w="1800"/>
             <w:tcBorders>
               <w:top w:val="single" w:color="B0B8C8" w:sz="1"/>
               <w:left w:val="single" w:color="B0B8C8" w:sz="1"/>
@@ -3732,7 +3850,7 @@
                 <w:sz w:val="20"/>
                 <w:szCs w:val="20"/>
               </w:rPr>
-              <w:t xml:space="preserve">Flag Count</w:t>
+              <w:t xml:space="preserve">Weighted Score</w:t>
             </w:r>
           </w:p>
         </w:tc>
@@ -3770,7 +3888,7 @@
         </w:tc>
         <w:tc>
           <w:tcPr>
-            <w:tcW w:type="dxa" w:w="5160"/>
+            <w:tcW w:type="dxa" w:w="4960"/>
             <w:tcBorders>
               <w:top w:val="single" w:color="B0B8C8" w:sz="1"/>
               <w:left w:val="single" w:color="B0B8C8" w:sz="1"/>
@@ -3833,7 +3951,7 @@
         </w:tc>
         <w:tc>
           <w:tcPr>
-            <w:tcW w:type="dxa" w:w="1600"/>
+            <w:tcW w:type="dxa" w:w="1800"/>
             <w:tcBorders>
               <w:top w:val="single" w:color="B0B8C8" w:sz="1"/>
               <w:left w:val="single" w:color="B0B8C8" w:sz="1"/>
@@ -3856,7 +3974,7 @@
                 <w:sz w:val="20"/>
                 <w:szCs w:val="20"/>
               </w:rPr>
-              <w:t xml:space="preserve">0 flags (or temp only)</w:t>
+              <w:t xml:space="preserve">&lt; 0.15 (or temp-only)</w:t>
             </w:r>
           </w:p>
         </w:tc>
@@ -3891,7 +4009,7 @@
         </w:tc>
         <w:tc>
           <w:tcPr>
-            <w:tcW w:type="dxa" w:w="5160"/>
+            <w:tcW w:type="dxa" w:w="4960"/>
             <w:tcBorders>
               <w:top w:val="single" w:color="B0B8C8" w:sz="1"/>
               <w:left w:val="single" w:color="B0B8C8" w:sz="1"/>
@@ -3914,7 +4032,7 @@
                 <w:sz w:val="20"/>
                 <w:szCs w:val="20"/>
               </w:rPr>
-              <w:t xml:space="preserve">All signals within personal baseline. If only temperature is elevated, it is treated as advisory because skin temp is too unreliable as a standalone indicator.</w:t>
+              <w:t xml:space="preserve">All signals within personal baseline. Temperature alone (elevation or drop) is treated as advisory.</w:t>
             </w:r>
           </w:p>
         </w:tc>
@@ -3951,7 +4069,7 @@
         </w:tc>
         <w:tc>
           <w:tcPr>
-            <w:tcW w:type="dxa" w:w="1600"/>
+            <w:tcW w:type="dxa" w:w="1800"/>
             <w:tcBorders>
               <w:top w:val="single" w:color="B0B8C8" w:sz="1"/>
               <w:left w:val="single" w:color="B0B8C8" w:sz="1"/>
@@ -3974,7 +4092,7 @@
                 <w:sz w:val="20"/>
                 <w:szCs w:val="20"/>
               </w:rPr>
-              <w:t xml:space="preserve">1 primary flag</w:t>
+              <w:t xml:space="preserve">0.15 – 0.40</w:t>
             </w:r>
           </w:p>
         </w:tc>
@@ -4009,7 +4127,7 @@
         </w:tc>
         <w:tc>
           <w:tcPr>
-            <w:tcW w:type="dxa" w:w="5160"/>
+            <w:tcW w:type="dxa" w:w="4960"/>
             <w:tcBorders>
               <w:top w:val="single" w:color="B0B8C8" w:sz="1"/>
               <w:left w:val="single" w:color="B0B8C8" w:sz="1"/>
@@ -4032,7 +4150,7 @@
                 <w:sz w:val="20"/>
                 <w:szCs w:val="20"/>
               </w:rPr>
-              <w:t xml:space="preserve">A single physiological system is deviating. This could represent genuine stress, but also has many benign explanations (caffeine, postural change, anxiety). Advisory-level intervention.</w:t>
+              <w:t xml:space="preserve">A physiological system is deviating, but below the distress threshold. Advisory-level intervention.</w:t>
             </w:r>
           </w:p>
         </w:tc>
@@ -4069,7 +4187,7 @@
         </w:tc>
         <w:tc>
           <w:tcPr>
-            <w:tcW w:type="dxa" w:w="1600"/>
+            <w:tcW w:type="dxa" w:w="1800"/>
             <w:tcBorders>
               <w:top w:val="single" w:color="B0B8C8" w:sz="1"/>
               <w:left w:val="single" w:color="B0B8C8" w:sz="1"/>
@@ -4092,7 +4210,7 @@
                 <w:sz w:val="20"/>
                 <w:szCs w:val="20"/>
               </w:rPr>
-              <w:t xml:space="preserve">2+ primary flags</w:t>
+              <w:t xml:space="preserve">&gt; 0.40</w:t>
             </w:r>
           </w:p>
         </w:tc>
@@ -4127,7 +4245,7 @@
         </w:tc>
         <w:tc>
           <w:tcPr>
-            <w:tcW w:type="dxa" w:w="5160"/>
+            <w:tcW w:type="dxa" w:w="4960"/>
             <w:tcBorders>
               <w:top w:val="single" w:color="B0B8C8" w:sz="1"/>
               <w:left w:val="single" w:color="B0B8C8" w:sz="1"/>
@@ -4150,7 +4268,7 @@
                 <w:sz w:val="20"/>
                 <w:szCs w:val="20"/>
               </w:rPr>
-              <w:t xml:space="preserve">Multiple physiological systems are simultaneously disrupted. The probability of a benign explanation drops significantly when HR, SpO2, and/or HRV all deviate together. Urgent intervention suggested.</w:t>
+              <w:t xml:space="preserve">Significant weighted physiological disruption. Higher-weight signals (HR, SpO2) contribute more than lower-weight signals (temp).</w:t>
             </w:r>
           </w:p>
         </w:tc>
@@ -4170,7 +4288,7 @@
           <w:sz w:val="26"/>
           <w:szCs w:val="26"/>
         </w:rPr>
-        <w:t xml:space="preserve">4.1 Why 2+ Signals for Distress?</w:t>
+        <w:t xml:space="preserve">4.1 Why Weighted Scores Instead of Flag Count?</w:t>
       </w:r>
     </w:p>
     <w:p>
@@ -4185,7 +4303,7 @@
           <w:sz w:val="22"/>
           <w:szCs w:val="22"/>
         </w:rPr>
-        <w:t xml:space="preserve">This follows the principle of converging evidence in clinical assessment. Any single signal can deviate for benign reasons:</w:t>
+        <w:t xml:space="preserve">The previous count-based approach (“any 2 flags = distress”) ignored signal meaning. Benign combinations would silently escalate:</w:t>
       </w:r>
     </w:p>
     <w:p>
@@ -4204,7 +4322,7 @@
           <w:sz w:val="22"/>
           <w:szCs w:val="22"/>
         </w:rPr>
-        <w:t xml:space="preserve">HR elevated alone: could be caffeine, standing up, mild anxiety, dehydration</w:t>
+        <w:t xml:space="preserve">Post-meal: mild HR elevation + mild HRV suppression = 2 flags → false distress</w:t>
       </w:r>
     </w:p>
     <w:p>
@@ -4223,7 +4341,7 @@
           <w:sz w:val="22"/>
           <w:szCs w:val="22"/>
         </w:rPr>
-        <w:t xml:space="preserve">SpO2 dipped alone: could be transient sensor error, breath-holding, sleeping posture</w:t>
+        <w:t xml:space="preserve">Hot environment: skin temp + thermoregulatory HR rise = 2 flags → false distress</w:t>
       </w:r>
     </w:p>
     <w:p>
@@ -4242,7 +4360,7 @@
           <w:sz w:val="22"/>
           <w:szCs w:val="22"/>
         </w:rPr>
-        <w:t xml:space="preserve">HRV suppressed alone: could be time-of-day variation, digestion, mild fatigue</w:t>
+        <w:t xml:space="preserve">Orthostatic: HR spike on standing + transient HRV dip = 2 flags → false distress</w:t>
       </w:r>
     </w:p>
     <w:p>
@@ -4257,7 +4375,7 @@
           <w:sz w:val="22"/>
           <w:szCs w:val="22"/>
         </w:rPr>
-        <w:t xml:space="preserve">When two or more systems show simultaneous deviation, the probability of a benign explanation decreases significantly. HR elevated AND SpO2 dropping suggests genuine cardiovascular or respiratory compromise, not just coffee.</w:t>
+        <w:t xml:space="preserve">The weighted-score approach (HR=0.35, SpO2=0.30, HR Stability=0.25, Temp=0.10) ensures that high-weight signals like SpO2 and HR drive the state more than low-weight signals. Two weak signals no longer automatically escalate to distress.</w:t>
       </w:r>
     </w:p>
     <w:p>
@@ -5693,7 +5811,7 @@
                 <w:sz w:val="20"/>
                 <w:szCs w:val="20"/>
               </w:rPr>
-              <w:t xml:space="preserve">SpO2 ≤ 90%</w:t>
+              <w:t xml:space="preserve">SpO2 ≤ 90% (10s sustained)</w:t>
             </w:r>
           </w:p>
         </w:tc>
@@ -5722,7 +5840,7 @@
                 <w:sz w:val="20"/>
                 <w:szCs w:val="20"/>
               </w:rPr>
-              <w:t xml:space="preserve">Immediate DISTRESS</w:t>
+              <w:t xml:space="preserve">DISTRESS after 10 consecutive frames</w:t>
             </w:r>
           </w:p>
         </w:tc>
@@ -5751,7 +5869,7 @@
                 <w:sz w:val="20"/>
                 <w:szCs w:val="20"/>
               </w:rPr>
-              <w:t xml:space="preserve">WHO defines SpO2 &lt; 90% as hypoxemia. Brain damage can begin within minutes of sustained hypoxia. Delay is not acceptable.</w:t>
+              <w:t xml:space="preserve">WHO defines SpO2 &lt; 90% as hypoxemia. However, consumer PPG has ±2–5% noise (Luks 2017). Single-frame dips are common from hand motion or poor ring placement. Requiring 10 consecutive sub-90% frames (~10 seconds) filters noise while remaining responsive.</w:t>
             </w:r>
           </w:p>
         </w:tc>
@@ -6636,7 +6754,7 @@
           <w:sz w:val="22"/>
           <w:szCs w:val="22"/>
         </w:rPr>
-        <w:t xml:space="preserve">The weights (HR=0.35, SpO2=0.30, HRV=0.25, Temp=0.10) are not arbitrary. They reflect three factors:</w:t>
+        <w:t xml:space="preserve">The weights (HR=0.35, SpO2=0.30, HR Stability=0.25, Temp=0.10) are not arbitrary. They reflect three factors and now drive the state machine directly via weighted-score gating:</w:t>
       </w:r>
     </w:p>
     <w:tbl>
@@ -6783,7 +6901,7 @@
                 <w:sz w:val="20"/>
                 <w:szCs w:val="20"/>
               </w:rPr>
-              <w:t xml:space="preserve">HRV (0.25)</w:t>
+              <w:t xml:space="preserve">HR Stability (0.25)</w:t>
             </w:r>
           </w:p>
         </w:tc>
@@ -7421,7 +7539,7 @@
           <w:sz w:val="22"/>
           <w:szCs w:val="22"/>
         </w:rPr>
-        <w:t xml:space="preserve">The sum of weights equals 1.0, forming a normalised confidence scoring basis. Temperature’s low weight (0.10) ensures it contributes minimally to confidence unless it accompanies primary signals.</w:t>
+        <w:t xml:space="preserve">The sum of weights equals 1.0, forming a normalised confidence scoring basis. Temperature’s low weight (0.10) ensures it contributes minimally unless it accompanies primary signals. Note: temperature DROP (vasoconstriction) contributes at 1.5× the normal weight, reflecting its stronger clinical significance in distress detection.</w:t>
       </w:r>
     </w:p>
     <w:p>
@@ -10755,7 +10873,7 @@
           <w:sz w:val="22"/>
           <w:szCs w:val="22"/>
         </w:rPr>
-        <w:t xml:space="preserve">The second detection layer is a 3-stage biomechanical fall detection model using the ring’s accelerometer and gyroscope data. Falls are one of the most dangerous events for wearable safety devices to detect, particularly for elderly users, those with mobility impairments, and women in distress situations.</w:t>
+        <w:t xml:space="preserve">The second detection layer is a 3-stage biomechanical fall detection model using the ring’s accelerometer data with gravity-vector orientation tracking and physiological corroboration. Thresholds are calibrated for finger-worn sensors per Kangas 2008 methodology.</w:t>
       </w:r>
     </w:p>
     <w:p>
@@ -10787,7 +10905,7 @@
           <w:sz w:val="22"/>
           <w:szCs w:val="22"/>
         </w:rPr>
-        <w:t xml:space="preserve">Unlike naive threshold-based fall detectors (which suffer from high false-positive rates), the WUALT fall detector requires ALL three stages to occur in temporal sequence:</w:t>
+        <w:t xml:space="preserve">The fall detector requires ALL three stages to occur in temporal sequence, with minimum-duration gates to filter single-sample noise:</w:t>
       </w:r>
     </w:p>
     <w:tbl>
@@ -10993,7 +11111,7 @@
                 <w:sz w:val="20"/>
                 <w:szCs w:val="20"/>
               </w:rPr>
-              <w:t xml:space="preserve">acc_mag &lt; threshold</w:t>
+              <w:t xml:space="preserve">acc_mag &lt; 0.5g for ≥3 consecutive samples</w:t>
             </w:r>
           </w:p>
         </w:tc>
@@ -11022,7 +11140,7 @@
                 <w:sz w:val="20"/>
                 <w:szCs w:val="20"/>
               </w:rPr>
-              <w:t xml:space="preserve">&lt; 0.5g</w:t>
+              <w:t xml:space="preserve">&lt; 0.5g, 3 samples (~120ms)</w:t>
             </w:r>
           </w:p>
         </w:tc>
@@ -11051,7 +11169,7 @@
                 <w:sz w:val="20"/>
                 <w:szCs w:val="20"/>
               </w:rPr>
-              <w:t xml:space="preserve">During a fall, the body enters brief free-fall where effective acceleration drops below 1g. 0.5g threshold catches genuine falls while filtering stumbles</w:t>
+              <w:t xml:space="preserve">Single sub-0.5g samples are common from rapid hand movements. Requiring 3 consecutive samples ensures genuine free-fall duration (Kangas 2008 uses 0.6g with sustained monitoring)</w:t>
             </w:r>
           </w:p>
         </w:tc>
@@ -11111,7 +11229,7 @@
                 <w:sz w:val="20"/>
                 <w:szCs w:val="20"/>
               </w:rPr>
-              <w:t xml:space="preserve">acc_mag &gt; threshold AND orientation change &gt; 60°</w:t>
+              <w:t xml:space="preserve">acc_mag &gt; 5.0g AND orientation change &gt; 60°</w:t>
             </w:r>
           </w:p>
         </w:tc>
@@ -11140,7 +11258,7 @@
                 <w:sz w:val="20"/>
                 <w:szCs w:val="20"/>
               </w:rPr>
-              <w:t xml:space="preserve">&gt; 3.0g, &gt; 60°</w:t>
+              <w:t xml:space="preserve">&gt; 5.0g, &gt; 60°</w:t>
             </w:r>
           </w:p>
         </w:tc>
@@ -11169,7 +11287,7 @@
                 <w:sz w:val="20"/>
                 <w:szCs w:val="20"/>
               </w:rPr>
-              <w:t xml:space="preserve">Impact with ground produces high-g spike. Orientation change confirms body position changed (not just a bump or clap)</w:t>
+              <w:t xml:space="preserve">Raised from 3.0g to 5.0g for finger sensors — hand activities routinely exceed 3g. Orientation uses low-pass gravity vector compared 1.5s post-impact (not raw acc at impact moment)</w:t>
             </w:r>
           </w:p>
         </w:tc>
@@ -11200,7 +11318,7 @@
                 <w:sz w:val="20"/>
                 <w:szCs w:val="20"/>
               </w:rPr>
-              <w:t xml:space="preserve">3. Post-fall inactivity</w:t>
+              <w:t xml:space="preserve">3. Post-fall outcome</w:t>
             </w:r>
           </w:p>
         </w:tc>
@@ -11229,7 +11347,7 @@
                 <w:sz w:val="20"/>
                 <w:szCs w:val="20"/>
               </w:rPr>
-              <w:t xml:space="preserve">dyn_acc &lt; threshold for 3+ seconds</w:t>
+              <w:t xml:space="preserve">Three possible outcomes based on movement pattern</w:t>
             </w:r>
           </w:p>
         </w:tc>
@@ -11258,7 +11376,7 @@
                 <w:sz w:val="20"/>
                 <w:szCs w:val="20"/>
               </w:rPr>
-              <w:t xml:space="preserve">&lt; 0.05g for 3s</w:t>
+              <w:t xml:space="preserve">See 15.4</w:t>
             </w:r>
           </w:p>
         </w:tc>
@@ -11287,7 +11405,7 @@
                 <w:sz w:val="20"/>
                 <w:szCs w:val="20"/>
               </w:rPr>
-              <w:t xml:space="preserve">Person remains motionless after impact — suggests injury, unconsciousness, or inability to move</w:t>
+              <w:t xml:space="preserve">Reworked from binary (confirm/cancel) to three-outcome classification for realistic post-fall behaviour</w:t>
             </w:r>
           </w:p>
         </w:tc>
@@ -11480,7 +11598,7 @@
                 <w:sz w:val="20"/>
                 <w:szCs w:val="20"/>
               </w:rPr>
-              <w:t xml:space="preserve">5.0 seconds</w:t>
+              <w:t xml:space="preserve">1.0 second</w:t>
             </w:r>
           </w:p>
         </w:tc>
@@ -11509,7 +11627,7 @@
                 <w:sz w:val="20"/>
                 <w:szCs w:val="20"/>
               </w:rPr>
-              <w:t xml:space="preserve">Maximum time between free-fall detection and impact. Falls happen fast — if impact doesn’t occur within 5s, the free-fall was something else</w:t>
+              <w:t xml:space="preserve">Free-fall from standing (1.5m) takes ~0.55s (Kangas 2008). 1s window prevents associating unrelated events</w:t>
             </w:r>
           </w:p>
         </w:tc>
@@ -11598,7 +11716,7 @@
                 <w:sz w:val="20"/>
                 <w:szCs w:val="20"/>
               </w:rPr>
-              <w:t xml:space="preserve">How long inactivity must persist to confirm. Brief stillness could be a pause; 3s sustained stillness after impact suggests incapacitation</w:t>
+              <w:t xml:space="preserve">How long stillness must persist to confirm incapacitation</w:t>
             </w:r>
           </w:p>
         </w:tc>
@@ -11687,7 +11805,96 @@
                 <w:sz w:val="20"/>
                 <w:szCs w:val="20"/>
               </w:rPr>
-              <w:t xml:space="preserve">If no inactivity confirmation within 10s of impact, the event is cancelled. Person got up — likely not a serious fall</w:t>
+              <w:t xml:space="preserve">Maximum time to determine post-impact outcome</w:t>
+            </w:r>
+          </w:p>
+        </w:tc>
+      </w:tr>
+      <w:tr>
+        <w:tc>
+          <w:tcPr>
+            <w:tcW w:type="dxa" w:w="2800"/>
+            <w:tcBorders>
+              <w:top w:val="single" w:color="B0B8C8" w:sz="1"/>
+              <w:left w:val="single" w:color="B0B8C8" w:sz="1"/>
+              <w:bottom w:val="single" w:color="B0B8C8" w:sz="1"/>
+              <w:right w:val="single" w:color="B0B8C8" w:sz="1"/>
+            </w:tcBorders>
+            <w:shd w:fill="F0F4FA" w:val="clear"/>
+            <w:tcMar>
+              <w:top w:type="dxa" w:w="80"/>
+              <w:left w:type="dxa" w:w="120"/>
+              <w:bottom w:type="dxa" w:w="80"/>
+              <w:right w:type="dxa" w:w="120"/>
+            </w:tcMar>
+          </w:tcPr>
+          <w:p>
+            <w:r>
+              <w:rPr>
+                <w:rFonts w:ascii="Arial" w:cs="Arial" w:eastAsia="Arial" w:hAnsi="Arial"/>
+                <w:color w:val="1A1A2E"/>
+                <w:sz w:val="20"/>
+                <w:szCs w:val="20"/>
+              </w:rPr>
+              <w:t xml:space="preserve">FALL_ORIENTATION_DELAY_S</w:t>
+            </w:r>
+          </w:p>
+        </w:tc>
+        <w:tc>
+          <w:tcPr>
+            <w:tcW w:type="dxa" w:w="1800"/>
+            <w:tcBorders>
+              <w:top w:val="single" w:color="B0B8C8" w:sz="1"/>
+              <w:left w:val="single" w:color="B0B8C8" w:sz="1"/>
+              <w:bottom w:val="single" w:color="B0B8C8" w:sz="1"/>
+              <w:right w:val="single" w:color="B0B8C8" w:sz="1"/>
+            </w:tcBorders>
+            <w:shd w:fill="F0F4FA" w:val="clear"/>
+            <w:tcMar>
+              <w:top w:type="dxa" w:w="80"/>
+              <w:left w:type="dxa" w:w="120"/>
+              <w:bottom w:type="dxa" w:w="80"/>
+              <w:right w:type="dxa" w:w="120"/>
+            </w:tcMar>
+          </w:tcPr>
+          <w:p>
+            <w:r>
+              <w:rPr>
+                <w:rFonts w:ascii="Arial" w:cs="Arial" w:eastAsia="Arial" w:hAnsi="Arial"/>
+                <w:color w:val="1A1A2E"/>
+                <w:sz w:val="20"/>
+                <w:szCs w:val="20"/>
+              </w:rPr>
+              <w:t xml:space="preserve">1.5 seconds</w:t>
+            </w:r>
+          </w:p>
+        </w:tc>
+        <w:tc>
+          <w:tcPr>
+            <w:tcW w:type="dxa" w:w="4760"/>
+            <w:tcBorders>
+              <w:top w:val="single" w:color="B0B8C8" w:sz="1"/>
+              <w:left w:val="single" w:color="B0B8C8" w:sz="1"/>
+              <w:bottom w:val="single" w:color="B0B8C8" w:sz="1"/>
+              <w:right w:val="single" w:color="B0B8C8" w:sz="1"/>
+            </w:tcBorders>
+            <w:shd w:fill="F0F4FA" w:val="clear"/>
+            <w:tcMar>
+              <w:top w:type="dxa" w:w="80"/>
+              <w:left w:type="dxa" w:w="120"/>
+              <w:bottom w:type="dxa" w:w="80"/>
+              <w:right w:type="dxa" w:w="120"/>
+            </w:tcMar>
+          </w:tcPr>
+          <w:p>
+            <w:r>
+              <w:rPr>
+                <w:rFonts w:ascii="Arial" w:cs="Arial" w:eastAsia="Arial" w:hAnsi="Arial"/>
+                <w:color w:val="1A1A2E"/>
+                <w:sz w:val="20"/>
+                <w:szCs w:val="20"/>
+              </w:rPr>
+              <w:t xml:space="preserve">Wait time after impact for dynamic motion to decay before measuring gravity-based orientation change</w:t>
             </w:r>
           </w:p>
         </w:tc>
@@ -11722,7 +11929,7 @@
           <w:sz w:val="22"/>
           <w:szCs w:val="22"/>
         </w:rPr>
-        <w:t xml:space="preserve">The detector operates as a finite state machine with four states:</w:t>
+        <w:t xml:space="preserve">The detector operates as a finite state machine with five states:</w:t>
       </w:r>
     </w:p>
     <w:p>
@@ -11752,7 +11959,7 @@
           <w:sz w:val="22"/>
           <w:szCs w:val="22"/>
         </w:rPr>
-        <w:t xml:space="preserve">→ Monitoring for free-fall. Records pre-fall orientation for each frame.</w:t>
+        <w:t xml:space="preserve">→ Monitoring for sustained free-fall. Records pre-fall gravity vector from low-pass filter.</w:t>
       </w:r>
     </w:p>
     <w:p>
@@ -11782,7 +11989,7 @@
           <w:sz w:val="22"/>
           <w:szCs w:val="22"/>
         </w:rPr>
-        <w:t xml:space="preserve">→ Free-fall confirmed. Waiting for high-g impact + orientation change within 5s window.</w:t>
+        <w:t xml:space="preserve">→ 3+ consecutive sub-0.5g samples confirmed. Waiting for high-g impact within 1.0s window.</w:t>
       </w:r>
     </w:p>
     <w:p>
@@ -11812,7 +12019,37 @@
           <w:sz w:val="22"/>
           <w:szCs w:val="22"/>
         </w:rPr>
-        <w:t xml:space="preserve">→ Impact confirmed. Monitoring for 3s of post-fall inactivity within 10s timeout.</w:t>
+        <w:t xml:space="preserve">→ Impact &gt; 5.0g confirmed. Deferred orientation check at 1.5s. Monitoring for post-fall outcome.</w:t>
+      </w:r>
+    </w:p>
+    <w:p>
+      <w:pPr>
+        <w:pStyle w:val="ListParagraph"/>
+        <w:numPr>
+          <w:ilvl w:val="0"/>
+          <w:numId w:val="7"/>
+        </w:numPr>
+        <w:spacing w:after="80"/>
+      </w:pPr>
+      <w:r>
+        <w:rPr>
+          <w:rFonts w:ascii="Arial" w:cs="Arial" w:eastAsia="Arial" w:hAnsi="Arial"/>
+          <w:b/>
+          <w:bCs/>
+          <w:color w:val="2E75B6"/>
+          <w:sz w:val="22"/>
+          <w:szCs w:val="22"/>
+        </w:rPr>
+        <w:t xml:space="preserve">CONFIRMED </w:t>
+      </w:r>
+      <w:r>
+        <w:rPr>
+          <w:rFonts w:ascii="Arial" w:cs="Arial" w:eastAsia="Arial" w:hAnsi="Arial"/>
+          <w:color w:val="1A1A2E"/>
+          <w:sz w:val="22"/>
+          <w:szCs w:val="22"/>
+        </w:rPr>
+        <w:t xml:space="preserve">→ Post-impact stillness ≥3s. High-confidence fall. Triggers emergency alerts.</w:t>
       </w:r>
     </w:p>
     <w:p>
@@ -11833,16 +12070,322 @@
           <w:sz w:val="22"/>
           <w:szCs w:val="22"/>
         </w:rPr>
-        <w:t xml:space="preserve">CONFIRMED / CANCELLED </w:t>
-      </w:r>
-      <w:r>
-        <w:rPr>
-          <w:rFonts w:ascii="Arial" w:cs="Arial" w:eastAsia="Arial" w:hAnsi="Arial"/>
-          <w:color w:val="1A1A2E"/>
-          <w:sz w:val="22"/>
-          <w:szCs w:val="22"/>
-        </w:rPr>
-        <w:t xml:space="preserve">→ Terminal states. CONFIRMED triggers emergency alerts; CANCELLED resets to IDLE.</w:t>
+        <w:t xml:space="preserve">CONFIRMED_UNCERTAIN </w:t>
+      </w:r>
+      <w:r>
+        <w:rPr>
+          <w:rFonts w:ascii="Arial" w:cs="Arial" w:eastAsia="Arial" w:hAnsi="Arial"/>
+          <w:color w:val="1A1A2E"/>
+          <w:sz w:val="22"/>
+          <w:szCs w:val="22"/>
+        </w:rPr>
+        <w:t xml:space="preserve">→ Weak/moderate movement for 10s+ post-impact. Lower confidence; defers to physiological corroboration.</w:t>
+      </w:r>
+    </w:p>
+    <w:p>
+      <w:pPr>
+        <w:pStyle w:val="Heading2"/>
+        <w:spacing w:after="160" w:before="280"/>
+      </w:pPr>
+      <w:r>
+        <w:rPr>
+          <w:rFonts w:ascii="Arial" w:cs="Arial" w:eastAsia="Arial" w:hAnsi="Arial"/>
+          <w:b/>
+          <w:bCs/>
+          <w:color w:val="2E75B6"/>
+          <w:sz w:val="26"/>
+          <w:szCs w:val="26"/>
+        </w:rPr>
+        <w:t xml:space="preserve">15.4 Three-Outcome Post-Impact Classification</w:t>
+      </w:r>
+    </w:p>
+    <w:p>
+      <w:pPr>
+        <w:spacing w:after="120"/>
+        <w:jc w:val="left"/>
+      </w:pPr>
+      <w:r>
+        <w:rPr>
+          <w:rFonts w:ascii="Arial" w:cs="Arial" w:eastAsia="Arial" w:hAnsi="Arial"/>
+          <w:color w:val="1A1A2E"/>
+          <w:sz w:val="22"/>
+          <w:szCs w:val="22"/>
+        </w:rPr>
+        <w:t xml:space="preserve">The previous binary (confirm/cancel) model cancelled falls when any movement was detected, which meant a conscious fallen person trying to get up or reach for help would be classified as a false alarm. The three-outcome model:</w:t>
+      </w:r>
+    </w:p>
+    <w:p>
+      <w:pPr>
+        <w:pStyle w:val="ListParagraph"/>
+        <w:numPr>
+          <w:ilvl w:val="0"/>
+          <w:numId w:val="8"/>
+        </w:numPr>
+        <w:spacing w:after="80"/>
+      </w:pPr>
+      <w:r>
+        <w:rPr>
+          <w:rFonts w:ascii="Arial" w:cs="Arial" w:eastAsia="Arial" w:hAnsi="Arial"/>
+          <w:b/>
+          <w:bCs/>
+          <w:color w:val="C0392B"/>
+          <w:sz w:val="22"/>
+          <w:szCs w:val="22"/>
+        </w:rPr>
+        <w:t xml:space="preserve">Stillness ≥3s (dyn_acc &lt; 0.05g): </w:t>
+      </w:r>
+      <w:r>
+        <w:rPr>
+          <w:rFonts w:ascii="Arial" w:cs="Arial" w:eastAsia="Arial" w:hAnsi="Arial"/>
+          <w:color w:val="1A1A2E"/>
+          <w:sz w:val="22"/>
+          <w:szCs w:val="22"/>
+        </w:rPr>
+        <w:t xml:space="preserve">CONFIRMED — unconscious or incapacitated</w:t>
+      </w:r>
+    </w:p>
+    <w:p>
+      <w:pPr>
+        <w:pStyle w:val="ListParagraph"/>
+        <w:numPr>
+          <w:ilvl w:val="0"/>
+          <w:numId w:val="8"/>
+        </w:numPr>
+        <w:spacing w:after="80"/>
+      </w:pPr>
+      <w:r>
+        <w:rPr>
+          <w:rFonts w:ascii="Arial" w:cs="Arial" w:eastAsia="Arial" w:hAnsi="Arial"/>
+          <w:b/>
+          <w:bCs/>
+          <w:color w:val="2D8A4E"/>
+          <w:sz w:val="22"/>
+          <w:szCs w:val="22"/>
+        </w:rPr>
+        <w:t xml:space="preserve">Vigorous activity ≥3s (dyn_acc &gt; 0.5g): </w:t>
+      </w:r>
+      <w:r>
+        <w:rPr>
+          <w:rFonts w:ascii="Arial" w:cs="Arial" w:eastAsia="Arial" w:hAnsi="Arial"/>
+          <w:color w:val="1A1A2E"/>
+          <w:sz w:val="22"/>
+          <w:szCs w:val="22"/>
+        </w:rPr>
+        <w:t xml:space="preserve">CANCELLED — person got up, clearly recovered</w:t>
+      </w:r>
+    </w:p>
+    <w:p>
+      <w:pPr>
+        <w:pStyle w:val="ListParagraph"/>
+        <w:numPr>
+          <w:ilvl w:val="0"/>
+          <w:numId w:val="8"/>
+        </w:numPr>
+        <w:spacing w:after="120"/>
+      </w:pPr>
+      <w:r>
+        <w:rPr>
+          <w:rFonts w:ascii="Arial" w:cs="Arial" w:eastAsia="Arial" w:hAnsi="Arial"/>
+          <w:b/>
+          <w:bCs/>
+          <w:color w:val="C07D10"/>
+          <w:sz w:val="22"/>
+          <w:szCs w:val="22"/>
+        </w:rPr>
+        <w:t xml:space="preserve">Weak/moderate movement 10s+ (0.05–0.5g): </w:t>
+      </w:r>
+      <w:r>
+        <w:rPr>
+          <w:rFonts w:ascii="Arial" w:cs="Arial" w:eastAsia="Arial" w:hAnsi="Arial"/>
+          <w:color w:val="1A1A2E"/>
+          <w:sz w:val="22"/>
+          <w:szCs w:val="22"/>
+        </w:rPr>
+        <w:t xml:space="preserve">CONFIRMED_UNCERTAIN — person may be struggling; defers to physiological corroboration</w:t>
+      </w:r>
+    </w:p>
+    <w:p>
+      <w:pPr>
+        <w:pStyle w:val="Heading2"/>
+        <w:spacing w:after="160" w:before="280"/>
+      </w:pPr>
+      <w:r>
+        <w:rPr>
+          <w:rFonts w:ascii="Arial" w:cs="Arial" w:eastAsia="Arial" w:hAnsi="Arial"/>
+          <w:b/>
+          <w:bCs/>
+          <w:color w:val="2E75B6"/>
+          <w:sz w:val="26"/>
+          <w:szCs w:val="26"/>
+        </w:rPr>
+        <w:t xml:space="preserve">15.5 Gravity-Based Orientation Check</w:t>
+      </w:r>
+    </w:p>
+    <w:p>
+      <w:pPr>
+        <w:spacing w:after="120"/>
+        <w:jc w:val="left"/>
+      </w:pPr>
+      <w:r>
+        <w:rPr>
+          <w:rFonts w:ascii="Arial" w:cs="Arial" w:eastAsia="Arial" w:hAnsi="Arial"/>
+          <w:color w:val="1A1A2E"/>
+          <w:sz w:val="22"/>
+          <w:szCs w:val="22"/>
+        </w:rPr>
+        <w:t xml:space="preserve">At the moment of a 5g impact, the raw accelerometer vector is dominated by dynamic force, not gravity. Measuring orientation change from raw acc at impact produces near-random results (Madgwick 2010). The fix: use the low-pass gravity vector from the preprocessing pipeline’s GravityEstimator, and delay the orientation comparison by 1.5 seconds post-impact to allow dynamic motion to decay.</w:t>
+      </w:r>
+    </w:p>
+    <w:p>
+      <w:pPr>
+        <w:pStyle w:val="Heading2"/>
+        <w:spacing w:after="160" w:before="280"/>
+      </w:pPr>
+      <w:r>
+        <w:rPr>
+          <w:rFonts w:ascii="Arial" w:cs="Arial" w:eastAsia="Arial" w:hAnsi="Arial"/>
+          <w:b/>
+          <w:bCs/>
+          <w:color w:val="2E75B6"/>
+          <w:sz w:val="26"/>
+          <w:szCs w:val="26"/>
+        </w:rPr>
+        <w:t xml:space="preserve">15.6 Physiological Corroboration</w:t>
+      </w:r>
+    </w:p>
+    <w:p>
+      <w:pPr>
+        <w:spacing w:after="120"/>
+        <w:jc w:val="left"/>
+      </w:pPr>
+      <w:r>
+        <w:rPr>
+          <w:rFonts w:ascii="Arial" w:cs="Arial" w:eastAsia="Arial" w:hAnsi="Arial"/>
+          <w:color w:val="1A1A2E"/>
+          <w:sz w:val="22"/>
+          <w:szCs w:val="22"/>
+        </w:rPr>
+        <w:t xml:space="preserve">After accelerometer-flagged impact, a 30-second corroboration window opens to check physiological signals. Confidence is adjusted based on:</w:t>
+      </w:r>
+    </w:p>
+    <w:p>
+      <w:pPr>
+        <w:pStyle w:val="ListParagraph"/>
+        <w:numPr>
+          <w:ilvl w:val="0"/>
+          <w:numId w:val="9"/>
+        </w:numPr>
+        <w:spacing w:after="80"/>
+      </w:pPr>
+      <w:r>
+        <w:rPr>
+          <w:rFonts w:ascii="Arial" w:cs="Arial" w:eastAsia="Arial" w:hAnsi="Arial"/>
+          <w:b/>
+          <w:bCs/>
+          <w:color w:val="1A1A2E"/>
+          <w:sz w:val="22"/>
+          <w:szCs w:val="22"/>
+        </w:rPr>
+        <w:t xml:space="preserve">HR surge ≥10 bpm within 10s: </w:t>
+      </w:r>
+      <w:r>
+        <w:rPr>
+          <w:rFonts w:ascii="Arial" w:cs="Arial" w:eastAsia="Arial" w:hAnsi="Arial"/>
+          <w:color w:val="1A1A2E"/>
+          <w:sz w:val="22"/>
+          <w:szCs w:val="22"/>
+        </w:rPr>
+        <w:t xml:space="preserve">+0.10 confidence (sympathetic response to impact)</w:t>
+      </w:r>
+    </w:p>
+    <w:p>
+      <w:pPr>
+        <w:pStyle w:val="ListParagraph"/>
+        <w:numPr>
+          <w:ilvl w:val="0"/>
+          <w:numId w:val="9"/>
+        </w:numPr>
+        <w:spacing w:after="80"/>
+      </w:pPr>
+      <w:r>
+        <w:rPr>
+          <w:rFonts w:ascii="Arial" w:cs="Arial" w:eastAsia="Arial" w:hAnsi="Arial"/>
+          <w:b/>
+          <w:bCs/>
+          <w:color w:val="1A1A2E"/>
+          <w:sz w:val="22"/>
+          <w:szCs w:val="22"/>
+        </w:rPr>
+        <w:t xml:space="preserve">HR drop ≤15 bpm within 30s: </w:t>
+      </w:r>
+      <w:r>
+        <w:rPr>
+          <w:rFonts w:ascii="Arial" w:cs="Arial" w:eastAsia="Arial" w:hAnsi="Arial"/>
+          <w:color w:val="1A1A2E"/>
+          <w:sz w:val="22"/>
+          <w:szCs w:val="22"/>
+        </w:rPr>
+        <w:t xml:space="preserve">+0.15 confidence (vasovagal/syncope — up to 50% of unexplained falls in elderly)</w:t>
+      </w:r>
+    </w:p>
+    <w:p>
+      <w:pPr>
+        <w:pStyle w:val="ListParagraph"/>
+        <w:numPr>
+          <w:ilvl w:val="0"/>
+          <w:numId w:val="9"/>
+        </w:numPr>
+        <w:spacing w:after="80"/>
+      </w:pPr>
+      <w:r>
+        <w:rPr>
+          <w:rFonts w:ascii="Arial" w:cs="Arial" w:eastAsia="Arial" w:hAnsi="Arial"/>
+          <w:b/>
+          <w:bCs/>
+          <w:color w:val="1A1A2E"/>
+          <w:sz w:val="22"/>
+          <w:szCs w:val="22"/>
+        </w:rPr>
+        <w:t xml:space="preserve">Skin temp drop (z &lt; −1.0): </w:t>
+      </w:r>
+      <w:r>
+        <w:rPr>
+          <w:rFonts w:ascii="Arial" w:cs="Arial" w:eastAsia="Arial" w:hAnsi="Arial"/>
+          <w:color w:val="1A1A2E"/>
+          <w:sz w:val="22"/>
+          <w:szCs w:val="22"/>
+        </w:rPr>
+        <w:t xml:space="preserve">+0.05 confidence (vasoconstriction)</w:t>
+      </w:r>
+    </w:p>
+    <w:p>
+      <w:pPr>
+        <w:pStyle w:val="ListParagraph"/>
+        <w:numPr>
+          <w:ilvl w:val="0"/>
+          <w:numId w:val="9"/>
+        </w:numPr>
+        <w:spacing w:after="80"/>
+      </w:pPr>
+      <w:r>
+        <w:rPr>
+          <w:rFonts w:ascii="Arial" w:cs="Arial" w:eastAsia="Arial" w:hAnsi="Arial"/>
+          <w:b/>
+          <w:bCs/>
+          <w:color w:val="1A1A2E"/>
+          <w:sz w:val="22"/>
+          <w:szCs w:val="22"/>
+        </w:rPr>
+        <w:t xml:space="preserve">No physiological change for 60s: </w:t>
+      </w:r>
+      <w:r>
+        <w:rPr>
+          <w:rFonts w:ascii="Arial" w:cs="Arial" w:eastAsia="Arial" w:hAnsi="Arial"/>
+          <w:color w:val="1A1A2E"/>
+          <w:sz w:val="22"/>
+          <w:szCs w:val="22"/>
+        </w:rPr>
+        <w:t xml:space="preserve">−0.20 confidence (likely false alarm)</w:t>
       </w:r>
     </w:p>
     <w:tbl>
@@ -11888,7 +12431,7 @@
                 <w:sz w:val="22"/>
                 <w:szCs w:val="22"/>
               </w:rPr>
-              <w:t xml:space="preserve">Why 3 Stages Instead of 1?</w:t>
+              <w:t xml:space="preserve">Ring Form Factor Limitation</w:t>
             </w:r>
           </w:p>
           <w:p>
@@ -11902,75 +12445,7 @@
                 <w:sz w:val="20"/>
                 <w:szCs w:val="20"/>
               </w:rPr>
-              <w:t xml:space="preserve">Single-threshold fall detectors (e.g., “impact &gt; 3g = fall”) produce excessive false positives from clapping hands, setting the ring on a table, or hitting a door. The 3-stage model requires a biomechanically plausible sequence: free-fall → impact + rotation → inactivity. This dramatically reduces false positives while maintaining sensitivity to real falls.</w:t>
-            </w:r>
-          </w:p>
-        </w:tc>
-      </w:tr>
-    </w:tbl>
-    <w:p>
-      <w:pPr>
-        <w:spacing w:after="120"/>
-      </w:pPr>
-    </w:p>
-    <w:tbl>
-      <w:tblPr>
-        <w:tblW w:type="dxa" w:w="9360"/>
-        <w:tblBorders>
-          <w:top w:val="single" w:color="auto" w:sz="4"/>
-          <w:left w:val="single" w:color="auto" w:sz="4"/>
-          <w:bottom w:val="single" w:color="auto" w:sz="4"/>
-          <w:right w:val="single" w:color="auto" w:sz="4"/>
-          <w:insideH w:val="single" w:color="auto" w:sz="4"/>
-          <w:insideV w:val="single" w:color="auto" w:sz="4"/>
-        </w:tblBorders>
-      </w:tblPr>
-      <w:tblGrid>
-        <w:gridCol w:w="9360"/>
-      </w:tblGrid>
-      <w:tr>
-        <w:tc>
-          <w:tcPr>
-            <w:tcW w:type="dxa" w:w="9360"/>
-            <w:tcBorders>
-              <w:top w:val="none" w:sz="0"/>
-              <w:left w:val="single" w:color="2E75B6" w:sz="12"/>
-              <w:bottom w:val="none" w:sz="0"/>
-              <w:right w:val="none" w:sz="0"/>
-            </w:tcBorders>
-            <w:shd w:fill="E8F0FE" w:val="clear"/>
-            <w:tcMar>
-              <w:top w:type="dxa" w:w="120"/>
-              <w:left w:type="dxa" w:w="200"/>
-              <w:bottom w:type="dxa" w:w="120"/>
-              <w:right w:type="dxa" w:w="160"/>
-            </w:tcMar>
-          </w:tcPr>
-          <w:p>
-            <w:r>
-              <w:rPr>
-                <w:rFonts w:ascii="Arial" w:cs="Arial" w:eastAsia="Arial" w:hAnsi="Arial"/>
-                <w:b/>
-                <w:bCs/>
-                <w:color w:val="2E75B6"/>
-                <w:sz w:val="22"/>
-                <w:szCs w:val="22"/>
-              </w:rPr>
-              <w:t xml:space="preserve">Orientation Bug Fix</w:t>
-            </w:r>
-          </w:p>
-          <w:p>
-            <w:pPr>
-              <w:spacing w:before="60"/>
-            </w:pPr>
-            <w:r>
-              <w:rPr>
-                <w:rFonts w:ascii="Arial" w:cs="Arial" w:eastAsia="Arial" w:hAnsi="Arial"/>
-                <w:color w:val="3A3A5C"/>
-                <w:sz w:val="20"/>
-                <w:szCs w:val="20"/>
-              </w:rPr>
-              <w:t xml:space="preserve">An early implementation bug set the pre-fall orientation AFTER checking for free-fall, causing the orientation comparison to measure angle change within the fall itself (always small) rather than pre-fall vs. post-impact (large). The fix ensures pre-fall orientation is captured BEFORE the free-fall check, and only updated during non-freefall frames.</w:t>
+              <w:t xml:space="preserve">Kangas 2008 concluded wrist is not an applicable site for fall detection; ring-mounted sensors have even higher kinematic independence from the torso. The WUALT fall detector is scoped as an assistive/supporting signal, not a standalone alert trigger. Expected FAR of several events per day and sensitivity &lt; 70%. This is documented in the Model Card.</w:t>
             </w:r>
           </w:p>
         </w:tc>
@@ -14068,7 +14543,7 @@
           <w:sz w:val="22"/>
           <w:szCs w:val="22"/>
         </w:rPr>
-        <w:t xml:space="preserve">When the user is in a safe, familiar environment, borderline physiological signals should not cause unnecessary alerts:</w:t>
+        <w:t xml:space="preserve">When the user is in a safe, familiar environment, borderline physiological signals should not cause unnecessary alerts. Suppression factors are deliberately conservative to account for intimate partner violence (IPV) — WHO 2021 data shows a significant proportion of violence occurs at home:</w:t>
       </w:r>
     </w:p>
     <w:p>
@@ -14098,7 +14573,7 @@
           <w:sz w:val="22"/>
           <w:szCs w:val="22"/>
         </w:rPr>
-        <w:t xml:space="preserve">Risk score × 0.5 — being at home dramatically reduces false alarm rates</w:t>
+        <w:t xml:space="preserve">Risk score × 0.85 — softened from 0.5 because IPV occurs at home. A strong suppression factor would mask genuine distress in domestic violence situations.</w:t>
       </w:r>
     </w:p>
     <w:p>
@@ -14175,7 +14650,7 @@
           <w:sz w:val="26"/>
           <w:szCs w:val="26"/>
         </w:rPr>
-        <w:t xml:space="preserve">16.6 Escalation Patterns (Women’s Safety)</w:t>
+        <w:t xml:space="preserve">16.6 Fail-Safe Defaults</w:t>
       </w:r>
     </w:p>
     <w:p>
@@ -14190,7 +14665,7 @@
           <w:sz w:val="22"/>
           <w:szCs w:val="22"/>
         </w:rPr>
-        <w:t xml:space="preserve">Certain dangerous combinations force immediate escalation regardless of physiological baseline:</w:t>
+        <w:t xml:space="preserve">The geospatial layer uses fail-safe defaults that err toward alertness when data is missing or ambiguous:</w:t>
       </w:r>
     </w:p>
     <w:p>
@@ -14211,16 +14686,16 @@
           <w:sz w:val="22"/>
           <w:szCs w:val="22"/>
         </w:rPr>
-        <w:t xml:space="preserve">Distress + night + unfamiliar + no phone: </w:t>
-      </w:r>
-      <w:r>
-        <w:rPr>
-          <w:rFonts w:ascii="Arial" w:cs="Arial" w:eastAsia="Arial" w:hAnsi="Arial"/>
-          <w:color w:val="1A1A2E"/>
-          <w:sz w:val="22"/>
-          <w:szCs w:val="22"/>
-        </w:rPr>
-        <w:t xml:space="preserve">Forces risk score to 0.90 (critical). This combination strongly suggests a dangerous situation.</w:t>
+        <w:t xml:space="preserve">is_known_area defaults to False: </w:t>
+      </w:r>
+      <w:r>
+        <w:rPr>
+          <w:rFonts w:ascii="Arial" w:cs="Arial" w:eastAsia="Arial" w:hAnsi="Arial"/>
+          <w:color w:val="1A1A2E"/>
+          <w:sz w:val="22"/>
+          <w:szCs w:val="22"/>
+        </w:rPr>
+        <w:t xml:space="preserve">If the system cannot determine whether the user’s location is familiar, it assumes unfamiliar. The previous default of True could mask danger in genuinely unknown areas.</w:t>
       </w:r>
     </w:p>
     <w:p>
@@ -14237,20 +14712,20 @@
           <w:rFonts w:ascii="Arial" w:cs="Arial" w:eastAsia="Arial" w:hAnsi="Arial"/>
           <w:b/>
           <w:bCs/>
-          <w:color w:val="C0392B"/>
-          <w:sz w:val="22"/>
-          <w:szCs w:val="22"/>
-        </w:rPr>
-        <w:t xml:space="preserve">Route deviation + distress: </w:t>
-      </w:r>
-      <w:r>
-        <w:rPr>
-          <w:rFonts w:ascii="Arial" w:cs="Arial" w:eastAsia="Arial" w:hAnsi="Arial"/>
-          <w:color w:val="1A1A2E"/>
-          <w:sz w:val="22"/>
-          <w:szCs w:val="22"/>
-        </w:rPr>
-        <w:t xml:space="preserve">If the user deviates significantly from their expected route while showing physiological distress, risk is escalated by +0.20.</w:t>
+          <w:color w:val="1A1A2E"/>
+          <w:sz w:val="22"/>
+          <w:szCs w:val="22"/>
+        </w:rPr>
+        <w:t xml:space="preserve">Phone disconnect requires 5-minute sustained disconnection: </w:t>
+      </w:r>
+      <w:r>
+        <w:rPr>
+          <w:rFonts w:ascii="Arial" w:cs="Arial" w:eastAsia="Arial" w:hAnsi="Arial"/>
+          <w:color w:val="1A1A2E"/>
+          <w:sz w:val="22"/>
+          <w:szCs w:val="22"/>
+        </w:rPr>
+        <w:t xml:space="preserve">Brief Bluetooth dropouts are common and do not indicate danger. The phone disconnect risk score is 0.4 (reduced from 0.8) and only activates after phone_disconnect_duration_s ≥ 300.</w:t>
       </w:r>
     </w:p>
     <w:p>
@@ -14260,27 +14735,27 @@
           <w:ilvl w:val="0"/>
           <w:numId w:val="9"/>
         </w:numPr>
-        <w:spacing w:after="120"/>
+        <w:spacing w:after="80"/>
       </w:pPr>
       <w:r>
         <w:rPr>
           <w:rFonts w:ascii="Arial" w:cs="Arial" w:eastAsia="Arial" w:hAnsi="Arial"/>
           <w:b/>
           <w:bCs/>
-          <w:color w:val="C0392B"/>
-          <w:sz w:val="22"/>
-          <w:szCs w:val="22"/>
-        </w:rPr>
-        <w:t xml:space="preserve">Phone lost + unfamiliar area: </w:t>
-      </w:r>
-      <w:r>
-        <w:rPr>
-          <w:rFonts w:ascii="Arial" w:cs="Arial" w:eastAsia="Arial" w:hAnsi="Arial"/>
-          <w:color w:val="1A1A2E"/>
-          <w:sz w:val="22"/>
-          <w:szCs w:val="22"/>
-        </w:rPr>
-        <w:t xml:space="preserve">Losing phone connection in an unfamiliar area adds +0.15 to risk. The ring becomes the user’s only safety device.</w:t>
+          <w:color w:val="1A1A2E"/>
+          <w:sz w:val="22"/>
+          <w:szCs w:val="22"/>
+        </w:rPr>
+        <w:t xml:space="preserve">Speed threshold 140 km/h: </w:t>
+      </w:r>
+      <w:r>
+        <w:rPr>
+          <w:rFonts w:ascii="Arial" w:cs="Arial" w:eastAsia="Arial" w:hAnsi="Arial"/>
+          <w:color w:val="1A1A2E"/>
+          <w:sz w:val="22"/>
+          <w:szCs w:val="22"/>
+        </w:rPr>
+        <w:t xml:space="preserve">Raised from 120 km/h. Highway speeds of 110–130 km/h are normal in many countries; 140+ km/h more reliably indicates dangerous driving or vehicle emergency.</w:t>
       </w:r>
     </w:p>
     <w:p>
@@ -14297,7 +14772,7 @@
           <w:sz w:val="26"/>
           <w:szCs w:val="26"/>
         </w:rPr>
-        <w:t xml:space="preserve">16.7 Privacy-First Architecture</w:t>
+        <w:t xml:space="preserve">16.7 Alert Priority: Severity-Based Selection</w:t>
       </w:r>
     </w:p>
     <w:p>
@@ -14312,72 +14787,255 @@
           <w:sz w:val="22"/>
           <w:szCs w:val="22"/>
         </w:rPr>
+        <w:t xml:space="preserve">When both physiological distress and geospatial safety alerts are active simultaneously, the system selects the alert with the HIGHEST severity rather than always preferring one type over the other. The previous design always chose the safety alert, which could suppress a critical physiological emergency in favour of a low-level location concern. The severity-based approach (max comparison) ensures the most urgent alert reaches the user regardless of its source layer.</w:t>
+      </w:r>
+    </w:p>
+    <w:p>
+      <w:pPr>
+        <w:pStyle w:val="Heading2"/>
+        <w:spacing w:after="160" w:before="280"/>
+      </w:pPr>
+      <w:r>
+        <w:rPr>
+          <w:rFonts w:ascii="Arial" w:cs="Arial" w:eastAsia="Arial" w:hAnsi="Arial"/>
+          <w:b/>
+          <w:bCs/>
+          <w:color w:val="2E75B6"/>
+          <w:sz w:val="26"/>
+          <w:szCs w:val="26"/>
+        </w:rPr>
+        <w:t xml:space="preserve">16.8 Escalation Patterns (Women’s Safety)</w:t>
+      </w:r>
+    </w:p>
+    <w:p>
+      <w:pPr>
+        <w:spacing w:after="120"/>
+        <w:jc w:val="left"/>
+      </w:pPr>
+      <w:r>
+        <w:rPr>
+          <w:rFonts w:ascii="Arial" w:cs="Arial" w:eastAsia="Arial" w:hAnsi="Arial"/>
+          <w:color w:val="1A1A2E"/>
+          <w:sz w:val="22"/>
+          <w:szCs w:val="22"/>
+        </w:rPr>
+        <w:t xml:space="preserve">Certain dangerous combinations force immediate escalation regardless of physiological baseline:</w:t>
+      </w:r>
+    </w:p>
+    <w:p>
+      <w:pPr>
+        <w:pStyle w:val="ListParagraph"/>
+        <w:numPr>
+          <w:ilvl w:val="0"/>
+          <w:numId w:val="10"/>
+        </w:numPr>
+        <w:spacing w:after="80"/>
+      </w:pPr>
+      <w:r>
+        <w:rPr>
+          <w:rFonts w:ascii="Arial" w:cs="Arial" w:eastAsia="Arial" w:hAnsi="Arial"/>
+          <w:b/>
+          <w:bCs/>
+          <w:color w:val="C0392B"/>
+          <w:sz w:val="22"/>
+          <w:szCs w:val="22"/>
+        </w:rPr>
+        <w:t xml:space="preserve">Distress + night + unfamiliar + no phone: </w:t>
+      </w:r>
+      <w:r>
+        <w:rPr>
+          <w:rFonts w:ascii="Arial" w:cs="Arial" w:eastAsia="Arial" w:hAnsi="Arial"/>
+          <w:color w:val="1A1A2E"/>
+          <w:sz w:val="22"/>
+          <w:szCs w:val="22"/>
+        </w:rPr>
+        <w:t xml:space="preserve">Forces risk score to 0.90 (critical). This combination strongly suggests a dangerous situation.</w:t>
+      </w:r>
+    </w:p>
+    <w:p>
+      <w:pPr>
+        <w:pStyle w:val="ListParagraph"/>
+        <w:numPr>
+          <w:ilvl w:val="0"/>
+          <w:numId w:val="10"/>
+        </w:numPr>
+        <w:spacing w:after="80"/>
+      </w:pPr>
+      <w:r>
+        <w:rPr>
+          <w:rFonts w:ascii="Arial" w:cs="Arial" w:eastAsia="Arial" w:hAnsi="Arial"/>
+          <w:b/>
+          <w:bCs/>
+          <w:color w:val="C0392B"/>
+          <w:sz w:val="22"/>
+          <w:szCs w:val="22"/>
+        </w:rPr>
+        <w:t xml:space="preserve">Route deviation + distress: </w:t>
+      </w:r>
+      <w:r>
+        <w:rPr>
+          <w:rFonts w:ascii="Arial" w:cs="Arial" w:eastAsia="Arial" w:hAnsi="Arial"/>
+          <w:color w:val="1A1A2E"/>
+          <w:sz w:val="22"/>
+          <w:szCs w:val="22"/>
+        </w:rPr>
+        <w:t xml:space="preserve">If the user deviates significantly from their expected route while showing physiological distress, risk is escalated by +0.20.</w:t>
+      </w:r>
+    </w:p>
+    <w:p>
+      <w:pPr>
+        <w:pStyle w:val="ListParagraph"/>
+        <w:numPr>
+          <w:ilvl w:val="0"/>
+          <w:numId w:val="10"/>
+        </w:numPr>
+        <w:spacing w:after="120"/>
+      </w:pPr>
+      <w:r>
+        <w:rPr>
+          <w:rFonts w:ascii="Arial" w:cs="Arial" w:eastAsia="Arial" w:hAnsi="Arial"/>
+          <w:b/>
+          <w:bCs/>
+          <w:color w:val="C0392B"/>
+          <w:sz w:val="22"/>
+          <w:szCs w:val="22"/>
+        </w:rPr>
+        <w:t xml:space="preserve">Phone lost + unfamiliar area: </w:t>
+      </w:r>
+      <w:r>
+        <w:rPr>
+          <w:rFonts w:ascii="Arial" w:cs="Arial" w:eastAsia="Arial" w:hAnsi="Arial"/>
+          <w:color w:val="1A1A2E"/>
+          <w:sz w:val="22"/>
+          <w:szCs w:val="22"/>
+        </w:rPr>
+        <w:t xml:space="preserve">Losing phone connection in an unfamiliar area adds +0.15 to risk. The ring becomes the user’s only safety device.</w:t>
+      </w:r>
+    </w:p>
+    <w:p>
+      <w:pPr>
+        <w:pStyle w:val="Heading2"/>
+        <w:spacing w:after="160" w:before="280"/>
+      </w:pPr>
+      <w:r>
+        <w:rPr>
+          <w:rFonts w:ascii="Arial" w:cs="Arial" w:eastAsia="Arial" w:hAnsi="Arial"/>
+          <w:b/>
+          <w:bCs/>
+          <w:color w:val="2E75B6"/>
+          <w:sz w:val="26"/>
+          <w:szCs w:val="26"/>
+        </w:rPr>
+        <w:t xml:space="preserve">16.9 Privacy-First Architecture</w:t>
+      </w:r>
+    </w:p>
+    <w:p>
+      <w:pPr>
+        <w:spacing w:after="120"/>
+        <w:jc w:val="left"/>
+      </w:pPr>
+      <w:r>
+        <w:rPr>
+          <w:rFonts w:ascii="Arial" w:cs="Arial" w:eastAsia="Arial" w:hAnsi="Arial"/>
+          <w:color w:val="1A1A2E"/>
+          <w:sz w:val="22"/>
+          <w:szCs w:val="22"/>
+        </w:rPr>
         <w:t xml:space="preserve">The geospatial layer never stores raw GPS coordinates. All location processing converts to zone booleans (is_home_zone, is_work_zone, is_known_area, is_unfamiliar_area) before any scoring. Only the boolean flags and computed risk scores are persisted. This ensures user location privacy even if data is compromised.</w:t>
       </w:r>
     </w:p>
-    <w:tbl>
-      <w:tblPr>
-        <w:tblW w:type="dxa" w:w="9360"/>
-        <w:tblBorders>
-          <w:top w:val="single" w:color="auto" w:sz="4"/>
-          <w:left w:val="single" w:color="auto" w:sz="4"/>
-          <w:bottom w:val="single" w:color="auto" w:sz="4"/>
-          <w:right w:val="single" w:color="auto" w:sz="4"/>
-          <w:insideH w:val="single" w:color="auto" w:sz="4"/>
-          <w:insideV w:val="single" w:color="auto" w:sz="4"/>
-        </w:tblBorders>
-      </w:tblPr>
-      <w:tblGrid>
-        <w:gridCol w:w="9360"/>
-      </w:tblGrid>
-      <w:tr>
-        <w:tc>
-          <w:tcPr>
-            <w:tcW w:type="dxa" w:w="9360"/>
-            <w:tcBorders>
-              <w:top w:val="none" w:sz="0"/>
-              <w:left w:val="single" w:color="2E75B6" w:sz="12"/>
-              <w:bottom w:val="none" w:sz="0"/>
-              <w:right w:val="none" w:sz="0"/>
-            </w:tcBorders>
-            <w:shd w:fill="E8F0FE" w:val="clear"/>
-            <w:tcMar>
-              <w:top w:type="dxa" w:w="120"/>
-              <w:left w:type="dxa" w:w="200"/>
-              <w:bottom w:type="dxa" w:w="120"/>
-              <w:right w:type="dxa" w:w="160"/>
-            </w:tcMar>
-          </w:tcPr>
-          <w:p>
-            <w:r>
-              <w:rPr>
-                <w:rFonts w:ascii="Arial" w:cs="Arial" w:eastAsia="Arial" w:hAnsi="Arial"/>
-                <w:b/>
-                <w:bCs/>
-                <w:color w:val="2E75B6"/>
-                <w:sz w:val="22"/>
-                <w:szCs w:val="22"/>
-              </w:rPr>
-              <w:t xml:space="preserve">30-Second Critical Persistence</w:t>
-            </w:r>
-          </w:p>
-          <w:p>
-            <w:pPr>
-              <w:spacing w:before="60"/>
-            </w:pPr>
-            <w:r>
-              <w:rPr>
-                <w:rFonts w:ascii="Arial" w:cs="Arial" w:eastAsia="Arial" w:hAnsi="Arial"/>
-                <w:color w:val="3A3A5C"/>
-                <w:sz w:val="20"/>
-                <w:szCs w:val="20"/>
-              </w:rPr>
-              <w:t xml:space="preserve">Before triggering emergency contacts at the critical risk level, the system requires 30 seconds of sustained critical risk. This prevents single-frame spikes from triggering irreversible actions while still responding quickly to genuine emergencies.</w:t>
-            </w:r>
-          </w:p>
-        </w:tc>
-      </w:tr>
-    </w:tbl>
+    <w:p>
+      <w:pPr>
+        <w:pStyle w:val="Heading2"/>
+        <w:spacing w:after="160" w:before="280"/>
+      </w:pPr>
+      <w:r>
+        <w:rPr>
+          <w:rFonts w:ascii="Arial" w:cs="Arial" w:eastAsia="Arial" w:hAnsi="Arial"/>
+          <w:b/>
+          <w:bCs/>
+          <w:color w:val="2E75B6"/>
+          <w:sz w:val="26"/>
+          <w:szCs w:val="26"/>
+        </w:rPr>
+        <w:t xml:space="preserve">16.10 Risk Persistence Gates</w:t>
+      </w:r>
+    </w:p>
+    <w:p>
+      <w:pPr>
+        <w:spacing w:after="120"/>
+        <w:jc w:val="left"/>
+      </w:pPr>
+      <w:r>
+        <w:rPr>
+          <w:rFonts w:ascii="Arial" w:cs="Arial" w:eastAsia="Arial" w:hAnsi="Arial"/>
+          <w:color w:val="1A1A2E"/>
+          <w:sz w:val="22"/>
+          <w:szCs w:val="22"/>
+        </w:rPr>
+        <w:t xml:space="preserve">Before triggering emergency actions, the system requires sustained risk at elevated levels:</w:t>
+      </w:r>
+    </w:p>
+    <w:p>
+      <w:pPr>
+        <w:pStyle w:val="ListParagraph"/>
+        <w:numPr>
+          <w:ilvl w:val="0"/>
+          <w:numId w:val="11"/>
+        </w:numPr>
+        <w:spacing w:after="80"/>
+      </w:pPr>
+      <w:r>
+        <w:rPr>
+          <w:rFonts w:ascii="Arial" w:cs="Arial" w:eastAsia="Arial" w:hAnsi="Arial"/>
+          <w:b/>
+          <w:bCs/>
+          <w:color w:val="C0392B"/>
+          <w:sz w:val="22"/>
+          <w:szCs w:val="22"/>
+        </w:rPr>
+        <w:t xml:space="preserve">Critical level: </w:t>
+      </w:r>
+      <w:r>
+        <w:rPr>
+          <w:rFonts w:ascii="Arial" w:cs="Arial" w:eastAsia="Arial" w:hAnsi="Arial"/>
+          <w:color w:val="1A1A2E"/>
+          <w:sz w:val="22"/>
+          <w:szCs w:val="22"/>
+        </w:rPr>
+        <w:t xml:space="preserve">30 seconds sustained before triggering emergency contacts. Prevents single-frame spikes from irreversible actions.</w:t>
+      </w:r>
+    </w:p>
+    <w:p>
+      <w:pPr>
+        <w:pStyle w:val="ListParagraph"/>
+        <w:numPr>
+          <w:ilvl w:val="0"/>
+          <w:numId w:val="11"/>
+        </w:numPr>
+        <w:spacing w:after="120"/>
+      </w:pPr>
+      <w:r>
+        <w:rPr>
+          <w:rFonts w:ascii="Arial" w:cs="Arial" w:eastAsia="Arial" w:hAnsi="Arial"/>
+          <w:b/>
+          <w:bCs/>
+          <w:color w:val="C07D10"/>
+          <w:sz w:val="22"/>
+          <w:szCs w:val="22"/>
+        </w:rPr>
+        <w:t xml:space="preserve">High risk level: </w:t>
+      </w:r>
+      <w:r>
+        <w:rPr>
+          <w:rFonts w:ascii="Arial" w:cs="Arial" w:eastAsia="Arial" w:hAnsi="Arial"/>
+          <w:color w:val="1A1A2E"/>
+          <w:sz w:val="22"/>
+          <w:szCs w:val="22"/>
+        </w:rPr>
+        <w:t xml:space="preserve">30 seconds sustained before promoting to high_risk. Extended from critical-only to prevent oscillation at the high-risk boundary.</w:t>
+      </w:r>
+    </w:p>
     <w:p>
       <w:pPr>
         <w:spacing w:after="120"/>
@@ -14402,6 +15060,23 @@
     </w:p>
     <w:p>
       <w:pPr>
+        <w:pStyle w:val="Heading2"/>
+        <w:spacing w:after="160" w:before="280"/>
+      </w:pPr>
+      <w:r>
+        <w:rPr>
+          <w:rFonts w:ascii="Arial" w:cs="Arial" w:eastAsia="Arial" w:hAnsi="Arial"/>
+          <w:b/>
+          <w:bCs/>
+          <w:color w:val="2E75B6"/>
+          <w:sz w:val="26"/>
+          <w:szCs w:val="26"/>
+        </w:rPr>
+        <w:t xml:space="preserve">17.1 Physiological Detection</w:t>
+      </w:r>
+    </w:p>
+    <w:p>
+      <w:pPr>
         <w:spacing w:after="120"/>
         <w:jc w:val="left"/>
       </w:pPr>
@@ -14465,7 +15140,7 @@
           <w:sz w:val="22"/>
           <w:szCs w:val="22"/>
         </w:rPr>
-        <w:t xml:space="preserve">Esco MR, Flatt AA (2014). Ultra-short-term heart rate variability indexes at rest and post-exercise in athletes. Journal of Sports Science and Medicine, 13(3), 535-541.</w:t>
+        <w:t xml:space="preserve">Luks AM, Swenson ER (2017). Pulse Oximetry for Monitoring Patients with COVID-19 at Home: Potential Pitfalls and Practical Guidance. Annals of the ATS, 17(9), 1040-1046.</w:t>
       </w:r>
     </w:p>
     <w:p>
@@ -14482,7 +15157,7 @@
           <w:sz w:val="22"/>
           <w:szCs w:val="22"/>
         </w:rPr>
-        <w:t xml:space="preserve">Shaffer F, Ginsberg JP (2017). An overview of heart rate variability metrics and norms. Frontiers in Public Health, 5, 258.</w:t>
+        <w:t xml:space="preserve">Esco MR, Flatt AA (2014). Ultra-short-term heart rate variability indexes at rest and post-exercise in athletes. Journal of Sports Science and Medicine, 13(3), 535-541.</w:t>
       </w:r>
     </w:p>
     <w:p>
@@ -14499,7 +15174,7 @@
           <w:sz w:val="22"/>
           <w:szCs w:val="22"/>
         </w:rPr>
-        <w:t xml:space="preserve">Thayer JF, Ahs F, Fredrikson M, Sollers JJ, Wager TD (2012). A meta-analysis of heart rate variability and neuroimaging studies. Neuroscience and Biobehavioral Reviews, 36(2), 747-756.</w:t>
+        <w:t xml:space="preserve">Shaffer F, Ginsberg JP (2017). An overview of heart rate variability metrics and norms. Frontiers in Public Health, 5, 258.</w:t>
       </w:r>
     </w:p>
     <w:p>
@@ -14516,7 +15191,143 @@
           <w:sz w:val="22"/>
           <w:szCs w:val="22"/>
         </w:rPr>
+        <w:t xml:space="preserve">Thayer JF, Ahs F, Fredrikson M, Sollers JJ, Wager TD (2012). A meta-analysis of heart rate variability and neuroimaging studies. Neuroscience and Biobehavioral Reviews, 36(2), 747-756.</w:t>
+      </w:r>
+    </w:p>
+    <w:p>
+      <w:pPr>
+        <w:spacing w:after="120"/>
+        <w:jc w:val="left"/>
+      </w:pPr>
+      <w:r>
+        <w:rPr>
+          <w:rFonts w:ascii="Arial" w:cs="Arial" w:eastAsia="Arial" w:hAnsi="Arial"/>
+          <w:i/>
+          <w:iCs/>
+          <w:color w:val="1A1A2E"/>
+          <w:sz w:val="22"/>
+          <w:szCs w:val="22"/>
+        </w:rPr>
         <w:t xml:space="preserve">Vila J, et al. (2007). Cardiac defense: From attention to action. International Journal of Psychophysiology, 66(3), 169-182.</w:t>
+      </w:r>
+    </w:p>
+    <w:p>
+      <w:pPr>
+        <w:pStyle w:val="Heading2"/>
+        <w:spacing w:after="160" w:before="280"/>
+      </w:pPr>
+      <w:r>
+        <w:rPr>
+          <w:rFonts w:ascii="Arial" w:cs="Arial" w:eastAsia="Arial" w:hAnsi="Arial"/>
+          <w:b/>
+          <w:bCs/>
+          <w:color w:val="2E75B6"/>
+          <w:sz w:val="26"/>
+          <w:szCs w:val="26"/>
+        </w:rPr>
+        <w:t xml:space="preserve">17.2 Fall Detection</w:t>
+      </w:r>
+    </w:p>
+    <w:p>
+      <w:pPr>
+        <w:spacing w:after="120"/>
+        <w:jc w:val="left"/>
+      </w:pPr>
+      <w:r>
+        <w:rPr>
+          <w:rFonts w:ascii="Arial" w:cs="Arial" w:eastAsia="Arial" w:hAnsi="Arial"/>
+          <w:i/>
+          <w:iCs/>
+          <w:color w:val="1A1A2E"/>
+          <w:sz w:val="22"/>
+          <w:szCs w:val="22"/>
+        </w:rPr>
+        <w:t xml:space="preserve">Kangas M, Konttila A, Lindgren P, Winblad I, Jamsa T (2008). Comparison of low-complexity fall detection algorithms for body attached accelerometers. Gait &amp; Posture, 28(2), 285-291.</w:t>
+      </w:r>
+    </w:p>
+    <w:p>
+      <w:pPr>
+        <w:spacing w:after="120"/>
+        <w:jc w:val="left"/>
+      </w:pPr>
+      <w:r>
+        <w:rPr>
+          <w:rFonts w:ascii="Arial" w:cs="Arial" w:eastAsia="Arial" w:hAnsi="Arial"/>
+          <w:i/>
+          <w:iCs/>
+          <w:color w:val="1A1A2E"/>
+          <w:sz w:val="22"/>
+          <w:szCs w:val="22"/>
+        </w:rPr>
+        <w:t xml:space="preserve">Madgwick SOH, Harrison AJL, Vaidyanathan R (2010). Estimation of IMU and MARG orientation using a gradient descent algorithm. IEEE International Conference on Rehabilitation Robotics, 1-7.</w:t>
+      </w:r>
+    </w:p>
+    <w:p>
+      <w:pPr>
+        <w:spacing w:after="120"/>
+        <w:jc w:val="left"/>
+      </w:pPr>
+      <w:r>
+        <w:rPr>
+          <w:rFonts w:ascii="Arial" w:cs="Arial" w:eastAsia="Arial" w:hAnsi="Arial"/>
+          <w:i/>
+          <w:iCs/>
+          <w:color w:val="1A1A2E"/>
+          <w:sz w:val="22"/>
+          <w:szCs w:val="22"/>
+        </w:rPr>
+        <w:t xml:space="preserve">Bourke AK, O’Brien JV, Lyons GM (2007). Evaluation of a threshold-based tri-axial accelerometer fall detection algorithm. Gait &amp; Posture, 26(2), 194-199.</w:t>
+      </w:r>
+    </w:p>
+    <w:p>
+      <w:pPr>
+        <w:spacing w:after="120"/>
+        <w:jc w:val="left"/>
+      </w:pPr>
+      <w:r>
+        <w:rPr>
+          <w:rFonts w:ascii="Arial" w:cs="Arial" w:eastAsia="Arial" w:hAnsi="Arial"/>
+          <w:i/>
+          <w:iCs/>
+          <w:color w:val="1A1A2E"/>
+          <w:sz w:val="22"/>
+          <w:szCs w:val="22"/>
+        </w:rPr>
+        <w:t xml:space="preserve">Bagala F, Becker C, Cappello A, Chiari L, et al. (2012). Evaluation of accelerometer-based fall detection algorithms on real-world falls. PLoS ONE, 7(5), e37062.</w:t>
+      </w:r>
+    </w:p>
+    <w:p>
+      <w:pPr>
+        <w:pStyle w:val="Heading2"/>
+        <w:spacing w:after="160" w:before="280"/>
+      </w:pPr>
+      <w:r>
+        <w:rPr>
+          <w:rFonts w:ascii="Arial" w:cs="Arial" w:eastAsia="Arial" w:hAnsi="Arial"/>
+          <w:b/>
+          <w:bCs/>
+          <w:color w:val="2E75B6"/>
+          <w:sz w:val="26"/>
+          <w:szCs w:val="26"/>
+        </w:rPr>
+        <w:t xml:space="preserve">17.3 Geospatial Safety &amp; IPV</w:t>
+      </w:r>
+    </w:p>
+    <w:p>
+      <w:pPr>
+        <w:spacing w:after="120"/>
+        <w:jc w:val="left"/>
+      </w:pPr>
+      <w:r>
+        <w:rPr>
+          <w:rFonts w:ascii="Arial" w:cs="Arial" w:eastAsia="Arial" w:hAnsi="Arial"/>
+          <w:i/>
+          <w:iCs/>
+          <w:color w:val="1A1A2E"/>
+          <w:sz w:val="22"/>
+          <w:szCs w:val="22"/>
+        </w:rPr>
+        <w:t xml:space="preserve">World Health Organization (2021). Violence Against Women Prevalence Estimates, 2018. Global, Regional and National Prevalence Estimates for Intimate Partner Violence Against Women. WHO Press.</w:t>
       </w:r>
     </w:p>
     <w:p>
@@ -14971,6 +15782,18 @@
   </w:num>
   <w:num w:numId="9">
     <w:abstractNumId w:val="8"/>
+    <w:lvlOverride w:ilvl="0">
+      <w:startOverride w:val="1"/>
+    </w:lvlOverride>
+  </w:num>
+  <w:num w:numId="10">
+    <w:abstractNumId w:val="9"/>
+    <w:lvlOverride w:ilvl="0">
+      <w:startOverride w:val="1"/>
+    </w:lvlOverride>
+  </w:num>
+  <w:num w:numId="11">
+    <w:abstractNumId w:val="11"/>
     <w:lvlOverride w:ilvl="0">
       <w:startOverride w:val="1"/>
     </w:lvlOverride>

</xml_diff>